<commit_message>
attandance and payslip related changes
</commit_message>
<xml_diff>
--- a/CRMITdesk-Demo-Runbook.docx
+++ b/CRMITdesk-Demo-Runbook.docx
@@ -322,6 +322,26 @@
       </w:r>
       <w:r>
         <w:t xml:space="preserve">Open a lead, click Score. If it says "AI not configured", set GROQ_API_KEY on the server — the AI moments carry this demo.</w:t>
+      </w:r>
+    </w:p>
+    <w:p>
+      <w:pPr>
+        <w:pStyle w:val="ListParagraph"/>
+        <w:numPr>
+          <w:ilvl w:val="0"/>
+          <w:numId w:val="2"/>
+        </w:numPr>
+        <w:spacing w:after="60" w:line="264"/>
+      </w:pPr>
+      <w:r>
+        <w:rPr>
+          <w:b/>
+          <w:bCs/>
+        </w:rPr>
+        <w:t xml:space="preserve">Confirm the September release is deployed. </w:t>
+      </w:r>
+      <w:r>
+        <w:t xml:space="preserve">Billing should show a fourth "Custom Licence" card and Attendance (as a manager) a "Live map" tab. If either is missing, the licensing/attendance work is not on this server yet — demo those parts from a local build (npm run dev after npx prisma migrate dev) or present them as "shipping this month". Never deploy in the minutes before a demo.</w:t>
       </w:r>
     </w:p>
     <w:p>
@@ -1324,7 +1344,7 @@
         <w:spacing w:after="140" w:line="276"/>
       </w:pPr>
       <w:r>
-        <w:t xml:space="preserve">Rehearse these above all: (1) the customer e-signing a quote on the public link while the invoice creates itself; (2) dragging a deal across the pipeline; (3) the AI command bar executing a dictated instruction behind a confirm card; (4) a ticket auto-routed, auto-drafted and turned into a KB article; (5) geo-verified check-in. For this audience add a sixth: (6) creating a custom module live and watching it appear in the sidebar — the "platform, not app" proof developers respect.</w:t>
+        <w:t xml:space="preserve">Rehearse these above all: (1) the customer e-signing a quote on the public link while the invoice creates itself; (2) dragging a deal across the pipeline; (3) the AI command bar executing a dictated instruction behind a confirm card; (4) a ticket auto-routed, auto-drafted and turned into a KB article; (5) geo-verified check-in. For this audience add a sixth: (6) creating a custom module live and watching it appear in the sidebar — the "platform, not app" proof developers respect. With the September release add two more: (7) a face-verified check-in followed by the manager’s Live map showing the person inside the office radius; (8) building a custom licence — toggling modules and seats while the price recalculates live, then changing a module’s price in the Platform Admin Pricing panel and watching the customer’s quote update.</w:t>
       </w:r>
     </w:p>
     <w:p>
@@ -1956,7 +1976,27 @@
         <w:t xml:space="preserve">Star moment: </w:t>
       </w:r>
       <w:r>
-        <w:t xml:space="preserve">Attendance → Check In on your phone or browser. "GPS-verified against an office geo-fence, or the office network — including a dynamic-DNS hostname for offices without a static IP. Multiple sessions a day; managers see who’s on-site live."</w:t>
+        <w:t xml:space="preserve">Attendance → Check In on your phone or browser. The webcam modal opens, finds your face and captures automatically — "three signals: GPS against an office geo-fence, the office network (including a dynamic-DNS hostname for offices without a static IP), and a face match against the employee’s enrolled Face ID. Multiple sessions a day." Developer aside: "the face model runs in the browser and only a 128-number signature is stored — never the photo; the server compares signatures."</w:t>
+      </w:r>
+    </w:p>
+    <w:p>
+      <w:pPr>
+        <w:pStyle w:val="ListParagraph"/>
+        <w:numPr>
+          <w:ilvl w:val="0"/>
+          <w:numId w:val="10"/>
+        </w:numPr>
+        <w:spacing w:after="60" w:line="264"/>
+      </w:pPr>
+      <w:r>
+        <w:rPr>
+          <w:b/>
+          <w:bCs/>
+        </w:rPr>
+        <w:t xml:space="preserve">Rules, auto check-out and the Live map: </w:t>
+      </w:r>
+      <w:r>
+        <w:t xml:space="preserve">HR Settings → Check-in / check-out verification. Show the rule editor: tick Location, Network, Face and flip All (AND) / Any (OR) — "on-site people pass by GPS, field staff pass by face; every customer decides." Point at the auto check-out toggle: "walk out of the geofence for five minutes and the session closes itself at the moment you left — no inflated hours." Then Attendance → Live map: office circles, green/amber/grey markers, click yourself to see today’s trail, press Locate now. Say plainly if asked: "location flows while the app is open; a closed phone gets a push asking to reopen it — always-on tracking is the native-app edition."</w:t>
       </w:r>
     </w:p>
     <w:p>
@@ -2387,7 +2427,47 @@
         <w:t xml:space="preserve">Plans: </w:t>
       </w:r>
       <w:r>
-        <w:t xml:space="preserve">Free (5 seats, core + limited AI) → Pro $49/mo (25 seats, full AI, automation, portal, 5GB) → Enterprise $149/mo (unlimited seats, SSO, white-label, 50GB). "Employees who never work the desk are free on every tier — the pricing story sells itself to HR-heavy businesses."</w:t>
+        <w:t xml:space="preserve">Free (5 seats, core + limited AI) → Pro $49/mo (25 seats, full AI, automation, portal, 5GB) → Enterprise $149/mo (unlimited seats, SSO, white-label, 50GB), each monthly or yearly (two months free). "Employees who never work the desk are free on every tier — the pricing story sells itself to HR-heavy businesses."</w:t>
+      </w:r>
+    </w:p>
+    <w:p>
+      <w:pPr>
+        <w:pStyle w:val="ListParagraph"/>
+        <w:numPr>
+          <w:ilvl w:val="0"/>
+          <w:numId w:val="14"/>
+        </w:numPr>
+        <w:spacing w:after="60" w:line="264"/>
+      </w:pPr>
+      <w:r>
+        <w:rPr>
+          <w:b/>
+          <w:bCs/>
+        </w:rPr>
+        <w:t xml:space="preserve">Star moment — Custom licence: </w:t>
+      </w:r>
+      <w:r>
+        <w:t xml:space="preserve">Billing → the fourth card, Build your licence. Drag seats to 60 (watch the 10% volume tier light up), tick only Workflow Automation and Advanced Analytics, switch to Yearly — the quote sidebar recalculates on every click: per-seat price, add-ons, discount, what Stripe will bill. "A customer pays for exactly the modules they use, per seat; Stripe checkout, seat changes in the portal sync back automatically, and if a payment fails they keep access through a grace period before dropping to Free — nothing is ever deleted."</w:t>
+      </w:r>
+    </w:p>
+    <w:p>
+      <w:pPr>
+        <w:pStyle w:val="ListParagraph"/>
+        <w:numPr>
+          <w:ilvl w:val="0"/>
+          <w:numId w:val="14"/>
+        </w:numPr>
+        <w:spacing w:after="60" w:line="264"/>
+      </w:pPr>
+      <w:r>
+        <w:rPr>
+          <w:b/>
+          <w:bCs/>
+        </w:rPr>
+        <w:t xml:space="preserve">Who sets the prices: </w:t>
+      </w:r>
+      <w:r>
+        <w:t xml:space="preserve">Platform Admin → Pricing. Change one module’s per-seat price or switch a module off for sale, save, and refresh the customer’s licence builder — the quote already reflects it. "The operator owns every price from one screen, live, no redeploy; a customer admin can only buy at those prices. For a reseller, that is the margin lever." Also show the licence editor on an org: plan, seats, CUSTOM with hand-picked features for negotiated deals.</w:t>
       </w:r>
     </w:p>
     <w:p>
@@ -2715,6 +2795,152 @@
                 <w:sz w:val="19"/>
                 <w:szCs w:val="19"/>
               </w:rPr>
+              <w:t xml:space="preserve">Camera blocked or face model slow to load</w:t>
+            </w:r>
+          </w:p>
+        </w:tc>
+        <w:tc>
+          <w:tcPr>
+            <w:tcW w:type="dxa" w:w="6160"/>
+            <w:tcMar>
+              <w:top w:type="dxa" w:w="60"/>
+              <w:left w:type="dxa" w:w="100"/>
+              <w:bottom w:type="dxa" w:w="60"/>
+              <w:right w:type="dxa" w:w="100"/>
+            </w:tcMar>
+          </w:tcPr>
+          <w:p>
+            <w:pPr>
+              <w:spacing w:after="0"/>
+            </w:pPr>
+            <w:r>
+              <w:rPr>
+                <w:sz w:val="19"/>
+                <w:szCs w:val="19"/>
+              </w:rPr>
+              <w:t xml:space="preserve">The model (6 MB) loads on first use — open the check-in modal once during prep so it is cached. If the camera is refused, switch the check-in rule to Any (OR) in HR Settings and check in on GPS; or show a seeded record’s "Face" badge in history.</w:t>
+            </w:r>
+          </w:p>
+        </w:tc>
+      </w:tr>
+      <w:tr>
+        <w:tc>
+          <w:tcPr>
+            <w:tcW w:type="dxa" w:w="3200"/>
+            <w:shd w:fill="F8FAFC" w:val="clear"/>
+            <w:tcMar>
+              <w:top w:type="dxa" w:w="60"/>
+              <w:left w:type="dxa" w:w="100"/>
+              <w:bottom w:type="dxa" w:w="60"/>
+              <w:right w:type="dxa" w:w="100"/>
+            </w:tcMar>
+          </w:tcPr>
+          <w:p>
+            <w:pPr>
+              <w:spacing w:after="0"/>
+            </w:pPr>
+            <w:r>
+              <w:rPr>
+                <w:sz w:val="19"/>
+                <w:szCs w:val="19"/>
+              </w:rPr>
+              <w:t xml:space="preserve">Live map is empty</w:t>
+            </w:r>
+          </w:p>
+        </w:tc>
+        <w:tc>
+          <w:tcPr>
+            <w:tcW w:type="dxa" w:w="6160"/>
+            <w:shd w:fill="F8FAFC" w:val="clear"/>
+            <w:tcMar>
+              <w:top w:type="dxa" w:w="60"/>
+              <w:left w:type="dxa" w:w="100"/>
+              <w:bottom w:type="dxa" w:w="60"/>
+              <w:right w:type="dxa" w:w="100"/>
+            </w:tcMar>
+          </w:tcPr>
+          <w:p>
+            <w:pPr>
+              <w:spacing w:after="0"/>
+            </w:pPr>
+            <w:r>
+              <w:rPr>
+                <w:sz w:val="19"/>
+                <w:szCs w:val="19"/>
+              </w:rPr>
+              <w:t xml:space="preserve">Only checked-in people with the app open appear. Check in on your phone first and keep the app in the foreground; an office location must exist in HR Settings for the geofence circle to draw.</w:t>
+            </w:r>
+          </w:p>
+        </w:tc>
+      </w:tr>
+      <w:tr>
+        <w:tc>
+          <w:tcPr>
+            <w:tcW w:type="dxa" w:w="3200"/>
+            <w:tcMar>
+              <w:top w:type="dxa" w:w="60"/>
+              <w:left w:type="dxa" w:w="100"/>
+              <w:bottom w:type="dxa" w:w="60"/>
+              <w:right w:type="dxa" w:w="100"/>
+            </w:tcMar>
+          </w:tcPr>
+          <w:p>
+            <w:pPr>
+              <w:spacing w:after="0"/>
+            </w:pPr>
+            <w:r>
+              <w:rPr>
+                <w:sz w:val="19"/>
+                <w:szCs w:val="19"/>
+              </w:rPr>
+              <w:t xml:space="preserve">Stripe checkout not configured</w:t>
+            </w:r>
+          </w:p>
+        </w:tc>
+        <w:tc>
+          <w:tcPr>
+            <w:tcW w:type="dxa" w:w="6160"/>
+            <w:tcMar>
+              <w:top w:type="dxa" w:w="60"/>
+              <w:left w:type="dxa" w:w="100"/>
+              <w:bottom w:type="dxa" w:w="60"/>
+              <w:right w:type="dxa" w:w="100"/>
+            </w:tcMar>
+          </w:tcPr>
+          <w:p>
+            <w:pPr>
+              <w:spacing w:after="0"/>
+            </w:pPr>
+            <w:r>
+              <w:rPr>
+                <w:sz w:val="19"/>
+                <w:szCs w:val="19"/>
+              </w:rPr>
+              <w:t xml:space="preserve">Stop at the quote sidebar — the live price is the moment; say "checkout is Stripe-hosted" and show the Platform Admin Pricing panel instead.</w:t>
+            </w:r>
+          </w:p>
+        </w:tc>
+      </w:tr>
+      <w:tr>
+        <w:tc>
+          <w:tcPr>
+            <w:tcW w:type="dxa" w:w="3200"/>
+            <w:tcMar>
+              <w:top w:type="dxa" w:w="60"/>
+              <w:left w:type="dxa" w:w="100"/>
+              <w:bottom w:type="dxa" w:w="60"/>
+              <w:right w:type="dxa" w:w="100"/>
+            </w:tcMar>
+          </w:tcPr>
+          <w:p>
+            <w:pPr>
+              <w:spacing w:after="0"/>
+            </w:pPr>
+            <w:r>
+              <w:rPr>
+                <w:sz w:val="19"/>
+                <w:szCs w:val="19"/>
+              </w:rPr>
               <w:t xml:space="preserve">Internet dies</w:t>
             </w:r>
           </w:p>
@@ -3156,6 +3382,152 @@
                 <w:sz w:val="19"/>
                 <w:szCs w:val="19"/>
               </w:rPr>
+              <w:t xml:space="preserve">How does face verification work, and is it safe?</w:t>
+            </w:r>
+          </w:p>
+        </w:tc>
+        <w:tc>
+          <w:tcPr>
+            <w:tcW w:type="dxa" w:w="6760"/>
+            <w:tcMar>
+              <w:top w:type="dxa" w:w="60"/>
+              <w:left w:type="dxa" w:w="100"/>
+              <w:bottom w:type="dxa" w:w="60"/>
+              <w:right w:type="dxa" w:w="100"/>
+            </w:tcMar>
+          </w:tcPr>
+          <w:p>
+            <w:pPr>
+              <w:spacing w:after="0"/>
+            </w:pPr>
+            <w:r>
+              <w:rPr>
+                <w:sz w:val="19"/>
+                <w:szCs w:val="19"/>
+              </w:rPr>
+              <w:t xml:space="preserve">The face-recognition model runs in the browser and produces a 128-number signature; the server stores only signatures (never photos) and compares by distance against a per-org strictness. Location and network checks run first, so an off-site attempt never touches biometric data. Employees enrol themselves, can remove it any time, and managers can reset it. Honest limits: the signature is computed client-side and there is no liveness check yet — a server-side provider such as AWS Rekognition can be plugged in behind the same endpoint.</w:t>
+            </w:r>
+          </w:p>
+        </w:tc>
+      </w:tr>
+      <w:tr>
+        <w:tc>
+          <w:tcPr>
+            <w:tcW w:type="dxa" w:w="2600"/>
+            <w:shd w:fill="F8FAFC" w:val="clear"/>
+            <w:tcMar>
+              <w:top w:type="dxa" w:w="60"/>
+              <w:left w:type="dxa" w:w="100"/>
+              <w:bottom w:type="dxa" w:w="60"/>
+              <w:right w:type="dxa" w:w="100"/>
+            </w:tcMar>
+          </w:tcPr>
+          <w:p>
+            <w:pPr>
+              <w:spacing w:after="0"/>
+            </w:pPr>
+            <w:r>
+              <w:rPr>
+                <w:sz w:val="19"/>
+                <w:szCs w:val="19"/>
+              </w:rPr>
+              <w:t xml:space="preserve">Can you track staff when the app is closed?</w:t>
+            </w:r>
+          </w:p>
+        </w:tc>
+        <w:tc>
+          <w:tcPr>
+            <w:tcW w:type="dxa" w:w="6760"/>
+            <w:shd w:fill="F8FAFC" w:val="clear"/>
+            <w:tcMar>
+              <w:top w:type="dxa" w:w="60"/>
+              <w:left w:type="dxa" w:w="100"/>
+              <w:bottom w:type="dxa" w:w="60"/>
+              <w:right w:type="dxa" w:w="100"/>
+            </w:tcMar>
+          </w:tcPr>
+          <w:p>
+            <w:pPr>
+              <w:spacing w:after="0"/>
+            </w:pPr>
+            <w:r>
+              <w:rPr>
+                <w:sz w:val="19"/>
+                <w:szCs w:val="19"/>
+              </w:rPr>
+              <w:t xml:space="preserve">No web app can — browsers give no GPS to a closed page and service workers have no geolocation. While the app is open (foreground or background tab) it pings every minute and answers "Locate now" instantly over SSE; when it is closed the server sends a push notification asking the person to reopen it, and the map shows "no recent fix". True always-on tracking is a native shell (Capacitor + background geolocation) posting to the same heartbeat endpoint — no server change.</w:t>
+            </w:r>
+          </w:p>
+        </w:tc>
+      </w:tr>
+      <w:tr>
+        <w:tc>
+          <w:tcPr>
+            <w:tcW w:type="dxa" w:w="2600"/>
+            <w:tcMar>
+              <w:top w:type="dxa" w:w="60"/>
+              <w:left w:type="dxa" w:w="100"/>
+              <w:bottom w:type="dxa" w:w="60"/>
+              <w:right w:type="dxa" w:w="100"/>
+            </w:tcMar>
+          </w:tcPr>
+          <w:p>
+            <w:pPr>
+              <w:spacing w:after="0"/>
+            </w:pPr>
+            <w:r>
+              <w:rPr>
+                <w:sz w:val="19"/>
+                <w:szCs w:val="19"/>
+              </w:rPr>
+              <w:t xml:space="preserve">How is the licence enforced?</w:t>
+            </w:r>
+          </w:p>
+        </w:tc>
+        <w:tc>
+          <w:tcPr>
+            <w:tcW w:type="dxa" w:w="6760"/>
+            <w:tcMar>
+              <w:top w:type="dxa" w:w="60"/>
+              <w:left w:type="dxa" w:w="100"/>
+              <w:bottom w:type="dxa" w:w="60"/>
+              <w:right w:type="dxa" w:w="100"/>
+            </w:tcMar>
+          </w:tcPr>
+          <w:p>
+            <w:pPr>
+              <w:spacing w:after="0"/>
+            </w:pPr>
+            <w:r>
+              <w:rPr>
+                <w:sz w:val="19"/>
+                <w:szCs w:val="19"/>
+              </w:rPr>
+              <w:t xml:space="preserve">One effective-licence evaluator reads the Stripe state (active, past-due with a grace window, cancelled) and hands every gate — seats, feature flags, hosted-storage quota — the same answer. A lapsed org drops to Free limits but keeps every user, rule and file (grandfathering). Custom licences store their module list on the subscription; the operator’s pricing is one JSON override layered over code defaults.</w:t>
+            </w:r>
+          </w:p>
+        </w:tc>
+      </w:tr>
+      <w:tr>
+        <w:tc>
+          <w:tcPr>
+            <w:tcW w:type="dxa" w:w="2600"/>
+            <w:tcMar>
+              <w:top w:type="dxa" w:w="60"/>
+              <w:left w:type="dxa" w:w="100"/>
+              <w:bottom w:type="dxa" w:w="60"/>
+              <w:right w:type="dxa" w:w="100"/>
+            </w:tcMar>
+          </w:tcPr>
+          <w:p>
+            <w:pPr>
+              <w:spacing w:after="0"/>
+            </w:pPr>
+            <w:r>
+              <w:rPr>
+                <w:sz w:val="19"/>
+                <w:szCs w:val="19"/>
+              </w:rPr>
               <w:t xml:space="preserve">What about scale?</w:t>
             </w:r>
           </w:p>
@@ -3711,7 +4083,57 @@
                 <w:sz w:val="19"/>
                 <w:szCs w:val="19"/>
               </w:rPr>
-              <w:t xml:space="preserve">Free forever tier to land; Pro $49/mo per org (not per seat) as the volume tier; Enterprise $149/mo for SSO/white-label. Simple enough to put on one slide.</w:t>
+              <w:t xml:space="preserve">Free forever tier to land; Pro $49/mo per org (not per seat) as the volume tier; Enterprise $149/mo for SSO/white-label; and a Custom licence for everyone in between — pick modules, pay per seat, volume discounts from 51 seats, two months free on yearly. The operator sets every price from Platform Admin without a release. Simple enough to put on one slide, flexible enough to close odd-shaped deals.</w:t>
+            </w:r>
+          </w:p>
+        </w:tc>
+      </w:tr>
+      <w:tr>
+        <w:tc>
+          <w:tcPr>
+            <w:tcW w:type="dxa" w:w="2600"/>
+            <w:shd w:fill="F8FAFC" w:val="clear"/>
+            <w:tcMar>
+              <w:top w:type="dxa" w:w="60"/>
+              <w:left w:type="dxa" w:w="100"/>
+              <w:bottom w:type="dxa" w:w="60"/>
+              <w:right w:type="dxa" w:w="100"/>
+            </w:tcMar>
+          </w:tcPr>
+          <w:p>
+            <w:pPr>
+              <w:spacing w:after="0"/>
+            </w:pPr>
+            <w:r>
+              <w:rPr>
+                <w:sz w:val="19"/>
+                <w:szCs w:val="19"/>
+              </w:rPr>
+              <w:t xml:space="preserve">Can a customer buy only some modules?</w:t>
+            </w:r>
+          </w:p>
+        </w:tc>
+        <w:tc>
+          <w:tcPr>
+            <w:tcW w:type="dxa" w:w="6760"/>
+            <w:shd w:fill="F8FAFC" w:val="clear"/>
+            <w:tcMar>
+              <w:top w:type="dxa" w:w="60"/>
+              <w:left w:type="dxa" w:w="100"/>
+              <w:bottom w:type="dxa" w:w="60"/>
+              <w:right w:type="dxa" w:w="100"/>
+            </w:tcMar>
+          </w:tcPr>
+          <w:p>
+            <w:pPr>
+              <w:spacing w:after="0"/>
+            </w:pPr>
+            <w:r>
+              <w:rPr>
+                <w:sz w:val="19"/>
+                <w:szCs w:val="19"/>
+              </w:rPr>
+              <w:t xml:space="preserve">Yes — Billing → Build your licence: any mix of Advanced AI, Workflow Automation, Customer Portal, Advanced Analytics, Custom Branding and Hosted Storage, for any number of seats, monthly or yearly, with the price shown live before checkout. Modules not licensed simply do not appear for that org.</w:t>
             </w:r>
           </w:p>
         </w:tc>

</xml_diff>